<commit_message>
fix: improve anchored header and footer media rendering (#200)
</commit_message>
<xml_diff>
--- a/e2e/fixtures/generic-render-regression.docx
+++ b/e2e/fixtures/generic-render-regression.docx
@@ -2969,212 +2969,56 @@
 </file>
 
 <file path=word/header1.xml><?xml version="1.0" encoding="utf-8"?>
-<w:hdr xmlns:wpc="http://schemas.microsoft.com/office/word/2010/wordprocessingCanvas" xmlns:cx="http://schemas.microsoft.com/office/drawing/2014/chartex" xmlns:cx1="http://schemas.microsoft.com/office/drawing/2015/9/8/chartex" xmlns:cx2="http://schemas.microsoft.com/office/drawing/2015/10/21/chartex" xmlns:cx3="http://schemas.microsoft.com/office/drawing/2016/5/9/chartex" xmlns:cx4="http://schemas.microsoft.com/office/drawing/2016/5/10/chartex" xmlns:cx5="http://schemas.microsoft.com/office/drawing/2016/5/11/chartex" xmlns:cx6="http://schemas.microsoft.com/office/drawing/2016/5/12/chartex" xmlns:cx7="http://schemas.microsoft.com/office/drawing/2016/5/13/chartex" xmlns:cx8="http://schemas.microsoft.com/office/drawing/2016/5/14/chartex" xmlns:mc="http://schemas.openxmlformats.org/markup-compatibility/2006" xmlns:aink="http://schemas.microsoft.com/office/drawing/2016/ink" xmlns:am3d="http://schemas.microsoft.com/office/drawing/2017/model3d" xmlns:o="urn:schemas-microsoft-com:office:office" xmlns:oel="http://schemas.microsoft.com/office/2019/extlst" xmlns:r="http://schemas.openxmlformats.org/officeDocument/2006/relationships" xmlns:m="http://schemas.openxmlformats.org/officeDocument/2006/math" xmlns:v="urn:schemas-microsoft-com:vml" xmlns:wp14="http://schemas.microsoft.com/office/word/2010/wordprocessingDrawing" xmlns:wp="http://schemas.openxmlformats.org/drawingml/2006/wordprocessingDrawing" xmlns:w10="urn:schemas-microsoft-com:office:word" xmlns:w="http://schemas.openxmlformats.org/wordprocessingml/2006/main" xmlns:w14="http://schemas.microsoft.com/office/word/2010/wordml" xmlns:w15="http://schemas.microsoft.com/office/word/2012/wordml" xmlns:w16cex="http://schemas.microsoft.com/office/word/2018/wordml/cex" xmlns:w16cid="http://schemas.microsoft.com/office/word/2016/wordml/cid" xmlns:w16="http://schemas.microsoft.com/office/word/2018/wordml" xmlns:w16du="http://schemas.microsoft.com/office/word/2023/wordml/word16du" xmlns:w16sdtdh="http://schemas.microsoft.com/office/word/2020/wordml/sdtdatahash" xmlns:w16sdtfl="http://schemas.microsoft.com/office/word/2024/wordml/sdtformatlock" xmlns:w16se="http://schemas.microsoft.com/office/word/2015/wordml/symex" xmlns:wpg="http://schemas.microsoft.com/office/word/2010/wordprocessingGroup" xmlns:wpi="http://schemas.microsoft.com/office/word/2010/wordprocessingInk" xmlns:wne="http://schemas.microsoft.com/office/word/2006/wordml" xmlns:wps="http://schemas.microsoft.com/office/word/2010/wordprocessingShape" mc:Ignorable="w14 w15 w16se w16cid w16 w16cex w16sdtdh w16sdtfl w16du wp14">
-  <w:p>
-    <w:pPr>
-      <w:tabs>
-        <w:tab w:val="left" w:pos="1809"/>
-      </w:tabs>
-      <w:jc w:val="both"/>
-      <w:rPr>
-        <w:rFonts w:cs="Arial"/>
-        <w:color w:val="808080"/>
-      </w:rPr>
-    </w:pPr>
-  </w:p>
-  <w:p>
-    <w:pPr>
-      <w:tabs>
-        <w:tab w:val="left" w:pos="1809"/>
-      </w:tabs>
-      <w:jc w:val="both"/>
-    </w:pPr>
-    <w:r>
-      <w:rPr>
-        <w:rFonts w:cs="Arial"/>
-        <w:color w:val="808080"/>
-      </w:rPr>
-      <w:t>Sample text</w:t>
-    </w:r>
-    <w:r>
-      <w:rPr>
-        <w:rFonts w:cs="Arial"/>
-        <w:color w:val="808080"/>
-      </w:rPr>
-      <w:t xml:space="preserve">Sample text</w:t>
-    </w:r>
-    <w:r>
-      <w:rPr>
-        <w:rFonts w:cs="Arial"/>
-        <w:color w:val="808080"/>
-      </w:rPr>
-      <w:t>Sample text</w:t>
-    </w:r>
-    <w:r>
-      <w:rPr>
-        <w:rFonts w:cs="Arial"/>
-        <w:color w:val="808080"/>
-      </w:rPr>
-      <w:t>Sample text</w:t>
-    </w:r>
-    <w:r>
-      <w:rPr>
-        <w:rFonts w:cs="Arial"/>
-        <w:color w:val="808080"/>
-      </w:rPr>
-      <w:t xml:space="preserve">Sample text</w:t>
-    </w:r>
-    <w:r>
-      <w:rPr>
-        <w:rFonts w:cs="Arial"/>
-        <w:color w:val="808080"/>
-      </w:rPr>
-      <w:t>Sample text</w:t>
-    </w:r>
-    <w:r>
-      <w:rPr>
-        <w:rFonts w:cs="Arial"/>
-        <w:color w:val="808080"/>
-      </w:rPr>
-      <w:t xml:space="preserve">Sample text</w:t>
-    </w:r>
-    <w:r>
-      <w:rPr>
-        <w:rFonts w:cs="Arial"/>
-        <w:color w:val="808080"/>
-      </w:rPr>
-      <w:t>Sample text</w:t>
-    </w:r>
-  </w:p>
+<w:hdr xmlns:r="http://schemas.openxmlformats.org/officeDocument/2006/relationships" xmlns:w="http://schemas.openxmlformats.org/wordprocessingml/2006/main" xmlns:wp="http://schemas.openxmlformats.org/drawingml/2006/wordprocessingDrawing" xmlns:a="http://schemas.openxmlformats.org/drawingml/2006/main" xmlns:pic="http://schemas.openxmlformats.org/drawingml/2006/picture">
   <w:p>
     <w:pPr>
       <w:pStyle w:val="Header"/>
     </w:pPr>
     <w:r>
-      <w:rPr>
-        <w:noProof/>
-      </w:rPr>
       <w:drawing>
-        <wp:inline distT="0" distB="0" distL="0" distR="0" wp14:anchorId="77FCD9D4" wp14:editId="73B83B3C">
-          <wp:extent cx="6840855" cy="586740"/>
-          <wp:effectExtent l="0" t="0" r="0" b="3810"/>
-          <wp:docPr id="581484816" name="Picture 2"/>
+        <wp:anchor distT="0" distB="0" distL="114300" distR="114300" simplePos="0" relativeHeight="251658240" behindDoc="0" locked="0" layoutInCell="1" allowOverlap="1">
+          <wp:simplePos x="0" y="0"/>
+          <wp:positionH relativeFrom="margin">
+            <wp:posOffset>4762500</wp:posOffset>
+          </wp:positionH>
+          <wp:positionV relativeFrom="margin">
+            <wp:posOffset>-596900</wp:posOffset>
+          </wp:positionV>
+          <wp:extent cx="1699404" cy="409440"/>
+          <wp:effectExtent l="0" t="0" r="0" b="0"/>
+          <wp:wrapSquare wrapText="bothSides"/>
+          <wp:docPr id="1" name="header-logo"/>
           <wp:cNvGraphicFramePr>
-            <a:graphicFrameLocks xmlns:a="http://schemas.openxmlformats.org/drawingml/2006/main" noChangeAspect="1"/>
+            <a:graphicFrameLocks noChangeAspect="1"/>
           </wp:cNvGraphicFramePr>
-          <a:graphic xmlns:a="http://schemas.openxmlformats.org/drawingml/2006/main">
+          <a:graphic>
             <a:graphicData uri="http://schemas.openxmlformats.org/drawingml/2006/picture">
-              <pic:pic xmlns:pic="http://schemas.openxmlformats.org/drawingml/2006/picture">
+              <pic:pic>
                 <pic:nvPicPr>
-                  <pic:cNvPr id="0" name="Picture 3"/>
-                  <pic:cNvPicPr>
-                    <a:picLocks noChangeAspect="1" noChangeArrowheads="1"/>
-                  </pic:cNvPicPr>
+                  <pic:cNvPr id="1" name="header-logo"/>
+                  <pic:cNvPicPr/>
                 </pic:nvPicPr>
                 <pic:blipFill>
-                  <a:blip r:embed="rId1">
-                    <a:extLst>
-                      <a:ext uri="{28A0092B-C50C-407E-A947-70E740481C1C}">
-                        <a14:useLocalDpi xmlns:a14="http://schemas.microsoft.com/office/drawing/2010/main" val="0"/>
-                      </a:ext>
-                    </a:extLst>
-                  </a:blip>
-                  <a:srcRect/>
+                  <a:blip r:embed="rId1"/>
                   <a:stretch>
                     <a:fillRect/>
                   </a:stretch>
                 </pic:blipFill>
-                <pic:spPr bwMode="auto">
+                <pic:spPr>
                   <a:xfrm>
                     <a:off x="0" y="0"/>
-                    <a:ext cx="6840855" cy="586740"/>
+                    <a:ext cx="1699404" cy="409440"/>
                   </a:xfrm>
                   <a:prstGeom prst="rect">
                     <a:avLst/>
                   </a:prstGeom>
-                  <a:noFill/>
-                  <a:ln>
-                    <a:noFill/>
-                  </a:ln>
                 </pic:spPr>
               </pic:pic>
             </a:graphicData>
           </a:graphic>
-        </wp:inline>
+        </wp:anchor>
       </w:drawing>
     </w:r>
-  </w:p>
-  <w:p>
-    <w:pPr>
-      <w:pStyle w:val="Header"/>
-      <w:tabs>
-        <w:tab w:val="left" w:pos="6204"/>
-      </w:tabs>
-    </w:pPr>
-    <w:r>
-      <w:tab/>
-    </w:r>
-    <w:r>
-      <w:rPr>
-        <w:noProof/>
-      </w:rPr>
-      <w:drawing>
-        <wp:inline distT="0" distB="0" distL="0" distR="0" wp14:anchorId="0B44EDF7" wp14:editId="305A88FC">
-          <wp:extent cx="6840855" cy="342419"/>
-          <wp:effectExtent l="0" t="0" r="0" b="635"/>
-          <wp:docPr id="894317379" name="Picture 1"/>
-          <wp:cNvGraphicFramePr>
-            <a:graphicFrameLocks xmlns:a="http://schemas.openxmlformats.org/drawingml/2006/main" noChangeAspect="1"/>
-          </wp:cNvGraphicFramePr>
-          <a:graphic xmlns:a="http://schemas.openxmlformats.org/drawingml/2006/main">
-            <a:graphicData uri="http://schemas.openxmlformats.org/drawingml/2006/picture">
-              <pic:pic xmlns:pic="http://schemas.openxmlformats.org/drawingml/2006/picture">
-                <pic:nvPicPr>
-                  <pic:cNvPr id="0" name="Picture 1"/>
-                  <pic:cNvPicPr>
-                    <a:picLocks noChangeAspect="1" noChangeArrowheads="1"/>
-                  </pic:cNvPicPr>
-                </pic:nvPicPr>
-                <pic:blipFill>
-                  <a:blip r:embed="rId2">
-                    <a:extLst>
-                      <a:ext uri="{28A0092B-C50C-407E-A947-70E740481C1C}">
-                        <a14:useLocalDpi xmlns:a14="http://schemas.microsoft.com/office/drawing/2010/main" val="0"/>
-                      </a:ext>
-                    </a:extLst>
-                  </a:blip>
-                  <a:srcRect/>
-                  <a:stretch>
-                    <a:fillRect/>
-                  </a:stretch>
-                </pic:blipFill>
-                <pic:spPr bwMode="auto">
-                  <a:xfrm>
-                    <a:off x="0" y="0"/>
-                    <a:ext cx="6840855" cy="342419"/>
-                  </a:xfrm>
-                  <a:prstGeom prst="rect">
-                    <a:avLst/>
-                  </a:prstGeom>
-                  <a:noFill/>
-                  <a:ln>
-                    <a:noFill/>
-                  </a:ln>
-                </pic:spPr>
-              </pic:pic>
-            </a:graphicData>
-          </a:graphic>
-        </wp:inline>
-      </w:drawing>
-    </w:r>
-  </w:p>
-  <w:p>
-    <w:pPr>
-      <w:pStyle w:val="Header"/>
-      <w:tabs>
-        <w:tab w:val="left" w:pos="6204"/>
-      </w:tabs>
-    </w:pPr>
   </w:p>
 </w:hdr>
 </file>

</xml_diff>